<commit_message>
Geschichte 8D Generalstände: Tafelskript nach Planungsstandard und Direkter Instruktion, Stichproben-Regel
Co-Authored-By: Claude Sonnet 5.5 <noreply@anthropic.com>
Claude-Session: https://claude.ai/code/session_01GXwmzpsaCraifErTDddPwN
</commit_message>
<xml_diff>
--- a/Geschichte_8D/Generalstaende/Tafelskript_Generalstaende_8D.docx
+++ b/Geschichte_8D/Generalstaende/Tafelskript_Generalstaende_8D.docx
@@ -48,6 +48,405 @@
         <w:t xml:space="preserve">Ziel: Die Klasse erarbeitet den Weg zu den Generalständen am Zeitstrahl (Text aus der 8C, hat gut funktioniert). Danach erlebt sie in einer Ständeversammlung selbst, wie Klerus und Adel sich hinter dem Rücken des Dritten Standes absprechen und ihn trotz Mehrheit überstimmen. Das Spiel ersetzt das Schulbeispiel aus der 8C (zu abstrakt) und den Gesprächsanteil (zu lastig). Aufbau nach AVIVA.</w:t>
       </w:r>
     </w:p>
+    <w:p>
+      <w:pPr>
+        <w:keepNext/>
+        <w:spacing w:after="60" w:before="160"/>
+      </w:pPr>
+      <w:r>
+        <w:rPr>
+          <w:rFonts w:ascii="Cambria" w:cs="Cambria" w:eastAsia="Cambria" w:hAnsi="Cambria"/>
+          <w:b/>
+          <w:bCs/>
+          <w:color w:val="1E2761"/>
+          <w:sz w:val="24"/>
+          <w:szCs w:val="24"/>
+        </w:rPr>
+        <w:t xml:space="preserve">Kopf der Planung</w:t>
+      </w:r>
+    </w:p>
+    <w:tbl>
+      <w:tblPr>
+        <w:tblW w:type="dxa" w:w="10206"/>
+        <w:tblBorders>
+          <w:top w:val="single" w:color="auto" w:sz="4"/>
+          <w:left w:val="single" w:color="auto" w:sz="4"/>
+          <w:bottom w:val="single" w:color="auto" w:sz="4"/>
+          <w:right w:val="single" w:color="auto" w:sz="4"/>
+          <w:insideH w:val="single" w:color="auto" w:sz="4"/>
+          <w:insideV w:val="single" w:color="auto" w:sz="4"/>
+        </w:tblBorders>
+      </w:tblPr>
+      <w:tblGrid>
+        <w:gridCol w:w="2600"/>
+        <w:gridCol w:w="7606"/>
+      </w:tblGrid>
+      <w:tr>
+        <w:trPr>
+          <w:cantSplit/>
+          <w:trHeight w:val="340" w:hRule="atLeast"/>
+        </w:trPr>
+        <w:tc>
+          <w:tcPr>
+            <w:tcW w:type="dxa" w:w="2600"/>
+            <w:tcBorders>
+              <w:top w:val="single" w:color="B9C6E8" w:sz="6"/>
+              <w:left w:val="single" w:color="B9C6E8" w:sz="6"/>
+              <w:bottom w:val="single" w:color="B9C6E8" w:sz="6"/>
+              <w:right w:val="single" w:color="B9C6E8" w:sz="6"/>
+            </w:tcBorders>
+            <w:shd w:fill="F4F7FD" w:color="auto" w:val="clear"/>
+            <w:tcMar>
+              <w:top w:type="dxa" w:w="70"/>
+              <w:left w:type="dxa" w:w="110"/>
+              <w:bottom w:type="dxa" w:w="70"/>
+              <w:right w:type="dxa" w:w="110"/>
+            </w:tcMar>
+            <w:vAlign w:val="center"/>
+          </w:tcPr>
+          <w:p>
+            <w:pPr>
+              <w:spacing w:after="0" w:before="0"/>
+            </w:pPr>
+            <w:r>
+              <w:rPr>
+                <w:rFonts w:ascii="Calibri" w:cs="Calibri" w:eastAsia="Calibri" w:hAnsi="Calibri"/>
+                <w:b/>
+                <w:bCs/>
+                <w:color w:val="000000"/>
+                <w:sz w:val="20"/>
+                <w:szCs w:val="20"/>
+              </w:rPr>
+              <w:t xml:space="preserve">Ziel (Ich kann …)</w:t>
+            </w:r>
+          </w:p>
+        </w:tc>
+        <w:tc>
+          <w:tcPr>
+            <w:tcW w:type="dxa" w:w="7606"/>
+            <w:tcBorders>
+              <w:top w:val="single" w:color="B9C6E8" w:sz="6"/>
+              <w:left w:val="single" w:color="B9C6E8" w:sz="6"/>
+              <w:bottom w:val="single" w:color="B9C6E8" w:sz="6"/>
+              <w:right w:val="single" w:color="B9C6E8" w:sz="6"/>
+            </w:tcBorders>
+            <w:tcMar>
+              <w:top w:type="dxa" w:w="70"/>
+              <w:left w:type="dxa" w:w="110"/>
+              <w:bottom w:type="dxa" w:w="70"/>
+              <w:right w:type="dxa" w:w="110"/>
+            </w:tcMar>
+            <w:vAlign w:val="center"/>
+          </w:tcPr>
+          <w:p>
+            <w:pPr>
+              <w:spacing w:after="0" w:before="0"/>
+            </w:pPr>
+            <w:r>
+              <w:rPr>
+                <w:rFonts w:ascii="Calibri" w:cs="Calibri" w:eastAsia="Calibri" w:hAnsi="Calibri"/>
+                <w:color w:val="000000"/>
+                <w:sz w:val="20"/>
+                <w:szCs w:val="20"/>
+              </w:rPr>
+              <w:t xml:space="preserve">… den Weg bis zu den Generalständen am Zeitstrahl erklären. … erklären, wie die Stände den Dritten Stand überstimmen konnten. … begründen, warum die Abstimmung nach Ständen unfair war.</w:t>
+            </w:r>
+          </w:p>
+        </w:tc>
+      </w:tr>
+      <w:tr>
+        <w:trPr>
+          <w:cantSplit/>
+          <w:trHeight w:val="340" w:hRule="atLeast"/>
+        </w:trPr>
+        <w:tc>
+          <w:tcPr>
+            <w:tcW w:type="dxa" w:w="2600"/>
+            <w:tcBorders>
+              <w:top w:val="single" w:color="B9C6E8" w:sz="6"/>
+              <w:left w:val="single" w:color="B9C6E8" w:sz="6"/>
+              <w:bottom w:val="single" w:color="B9C6E8" w:sz="6"/>
+              <w:right w:val="single" w:color="B9C6E8" w:sz="6"/>
+            </w:tcBorders>
+            <w:shd w:fill="F4F7FD" w:color="auto" w:val="clear"/>
+            <w:tcMar>
+              <w:top w:type="dxa" w:w="70"/>
+              <w:left w:type="dxa" w:w="110"/>
+              <w:bottom w:type="dxa" w:w="70"/>
+              <w:right w:type="dxa" w:w="110"/>
+            </w:tcMar>
+            <w:vAlign w:val="center"/>
+          </w:tcPr>
+          <w:p>
+            <w:pPr>
+              <w:spacing w:after="0" w:before="0"/>
+            </w:pPr>
+            <w:r>
+              <w:rPr>
+                <w:rFonts w:ascii="Calibri" w:cs="Calibri" w:eastAsia="Calibri" w:hAnsi="Calibri"/>
+                <w:b/>
+                <w:bCs/>
+                <w:color w:val="000000"/>
+                <w:sz w:val="20"/>
+                <w:szCs w:val="20"/>
+              </w:rPr>
+              <w:t xml:space="preserve">Prüfaufgabe: Woran erkenne ich es?</w:t>
+            </w:r>
+          </w:p>
+        </w:tc>
+        <w:tc>
+          <w:tcPr>
+            <w:tcW w:type="dxa" w:w="7606"/>
+            <w:tcBorders>
+              <w:top w:val="single" w:color="B9C6E8" w:sz="6"/>
+              <w:left w:val="single" w:color="B9C6E8" w:sz="6"/>
+              <w:bottom w:val="single" w:color="B9C6E8" w:sz="6"/>
+              <w:right w:val="single" w:color="B9C6E8" w:sz="6"/>
+            </w:tcBorders>
+            <w:tcMar>
+              <w:top w:type="dxa" w:w="70"/>
+              <w:left w:type="dxa" w:w="110"/>
+              <w:bottom w:type="dxa" w:w="70"/>
+              <w:right w:type="dxa" w:w="110"/>
+            </w:tcMar>
+            <w:vAlign w:val="center"/>
+          </w:tcPr>
+          <w:p>
+            <w:pPr>
+              <w:spacing w:after="0" w:before="0"/>
+            </w:pPr>
+            <w:r>
+              <w:rPr>
+                <w:rFonts w:ascii="Calibri" w:cs="Calibri" w:eastAsia="Calibri" w:hAnsi="Calibri"/>
+                <w:color w:val="000000"/>
+                <w:sz w:val="20"/>
+                <w:szCs w:val="20"/>
+              </w:rPr>
+              <w:t xml:space="preserve">Zeitstrahl ausgefüllt (Ziel 1). Ü3 Satz 1 und 2 (Ziel 2). Ü3 Satz 3 mit einer Zahl (Ziel 3). „Heute habe ich gelernt, …“ im Heft.</w:t>
+            </w:r>
+          </w:p>
+        </w:tc>
+      </w:tr>
+      <w:tr>
+        <w:trPr>
+          <w:cantSplit/>
+          <w:trHeight w:val="340" w:hRule="atLeast"/>
+        </w:trPr>
+        <w:tc>
+          <w:tcPr>
+            <w:tcW w:type="dxa" w:w="2600"/>
+            <w:tcBorders>
+              <w:top w:val="single" w:color="B9C6E8" w:sz="6"/>
+              <w:left w:val="single" w:color="B9C6E8" w:sz="6"/>
+              <w:bottom w:val="single" w:color="B9C6E8" w:sz="6"/>
+              <w:right w:val="single" w:color="B9C6E8" w:sz="6"/>
+            </w:tcBorders>
+            <w:shd w:fill="F4F7FD" w:color="auto" w:val="clear"/>
+            <w:tcMar>
+              <w:top w:type="dxa" w:w="70"/>
+              <w:left w:type="dxa" w:w="110"/>
+              <w:bottom w:type="dxa" w:w="70"/>
+              <w:right w:type="dxa" w:w="110"/>
+            </w:tcMar>
+            <w:vAlign w:val="center"/>
+          </w:tcPr>
+          <w:p>
+            <w:pPr>
+              <w:spacing w:after="0" w:before="0"/>
+            </w:pPr>
+            <w:r>
+              <w:rPr>
+                <w:rFonts w:ascii="Calibri" w:cs="Calibri" w:eastAsia="Calibri" w:hAnsi="Calibri"/>
+                <w:b/>
+                <w:bCs/>
+                <w:color w:val="000000"/>
+                <w:sz w:val="20"/>
+                <w:szCs w:val="20"/>
+              </w:rPr>
+              <w:t xml:space="preserve">Mindestziel</w:t>
+            </w:r>
+          </w:p>
+        </w:tc>
+        <w:tc>
+          <w:tcPr>
+            <w:tcW w:type="dxa" w:w="7606"/>
+            <w:tcBorders>
+              <w:top w:val="single" w:color="B9C6E8" w:sz="6"/>
+              <w:left w:val="single" w:color="B9C6E8" w:sz="6"/>
+              <w:bottom w:val="single" w:color="B9C6E8" w:sz="6"/>
+              <w:right w:val="single" w:color="B9C6E8" w:sz="6"/>
+            </w:tcBorders>
+            <w:tcMar>
+              <w:top w:type="dxa" w:w="70"/>
+              <w:left w:type="dxa" w:w="110"/>
+              <w:bottom w:type="dxa" w:w="70"/>
+              <w:right w:type="dxa" w:w="110"/>
+            </w:tcMar>
+            <w:vAlign w:val="center"/>
+          </w:tcPr>
+          <w:p>
+            <w:pPr>
+              <w:spacing w:after="0" w:before="0"/>
+            </w:pPr>
+            <w:r>
+              <w:rPr>
+                <w:rFonts w:ascii="Calibri" w:cs="Calibri" w:eastAsia="Calibri" w:hAnsi="Calibri"/>
+                <w:color w:val="000000"/>
+                <w:sz w:val="20"/>
+                <w:szCs w:val="20"/>
+              </w:rPr>
+              <w:t xml:space="preserve">Ziel 1 und 2. Alles, was mit * steht, ist Zusatz (Ü3 Satz 3, Sportverein-Beispiel). „Auswerten“ bleibt immer.</w:t>
+            </w:r>
+          </w:p>
+        </w:tc>
+      </w:tr>
+      <w:tr>
+        <w:trPr>
+          <w:cantSplit/>
+          <w:trHeight w:val="340" w:hRule="atLeast"/>
+        </w:trPr>
+        <w:tc>
+          <w:tcPr>
+            <w:tcW w:type="dxa" w:w="2600"/>
+            <w:tcBorders>
+              <w:top w:val="single" w:color="B9C6E8" w:sz="6"/>
+              <w:left w:val="single" w:color="B9C6E8" w:sz="6"/>
+              <w:bottom w:val="single" w:color="B9C6E8" w:sz="6"/>
+              <w:right w:val="single" w:color="B9C6E8" w:sz="6"/>
+            </w:tcBorders>
+            <w:shd w:fill="F4F7FD" w:color="auto" w:val="clear"/>
+            <w:tcMar>
+              <w:top w:type="dxa" w:w="70"/>
+              <w:left w:type="dxa" w:w="110"/>
+              <w:bottom w:type="dxa" w:w="70"/>
+              <w:right w:type="dxa" w:w="110"/>
+            </w:tcMar>
+            <w:vAlign w:val="center"/>
+          </w:tcPr>
+          <w:p>
+            <w:pPr>
+              <w:spacing w:after="0" w:before="0"/>
+            </w:pPr>
+            <w:r>
+              <w:rPr>
+                <w:rFonts w:ascii="Calibri" w:cs="Calibri" w:eastAsia="Calibri" w:hAnsi="Calibri"/>
+                <w:b/>
+                <w:bCs/>
+                <w:color w:val="000000"/>
+                <w:sz w:val="20"/>
+                <w:szCs w:val="20"/>
+              </w:rPr>
+              <w:t xml:space="preserve">Beitrag zur Reihe</w:t>
+            </w:r>
+          </w:p>
+        </w:tc>
+        <w:tc>
+          <w:tcPr>
+            <w:tcW w:type="dxa" w:w="7606"/>
+            <w:tcBorders>
+              <w:top w:val="single" w:color="B9C6E8" w:sz="6"/>
+              <w:left w:val="single" w:color="B9C6E8" w:sz="6"/>
+              <w:bottom w:val="single" w:color="B9C6E8" w:sz="6"/>
+              <w:right w:val="single" w:color="B9C6E8" w:sz="6"/>
+            </w:tcBorders>
+            <w:tcMar>
+              <w:top w:type="dxa" w:w="70"/>
+              <w:left w:type="dxa" w:w="110"/>
+              <w:bottom w:type="dxa" w:w="70"/>
+              <w:right w:type="dxa" w:w="110"/>
+            </w:tcMar>
+            <w:vAlign w:val="center"/>
+          </w:tcPr>
+          <w:p>
+            <w:pPr>
+              <w:spacing w:after="0" w:before="0"/>
+            </w:pPr>
+            <w:r>
+              <w:rPr>
+                <w:rFonts w:ascii="Calibri" w:cs="Calibri" w:eastAsia="Calibri" w:hAnsi="Calibri"/>
+                <w:color w:val="000000"/>
+                <w:sz w:val="20"/>
+                <w:szCs w:val="20"/>
+              </w:rPr>
+              <w:t xml:space="preserve">Stunde 1 von 11 (Sequenz Französische Revolution). Sie legt die Ursachen und den Streit um die Abstimmungsregel. Daran knüpft Stunde 2 an: Der Dritte Stand fordert die Abstimmung nach Köpfen und gründet die Nationalversammlung.</w:t>
+            </w:r>
+          </w:p>
+        </w:tc>
+      </w:tr>
+      <w:tr>
+        <w:trPr>
+          <w:cantSplit/>
+          <w:trHeight w:val="340" w:hRule="atLeast"/>
+        </w:trPr>
+        <w:tc>
+          <w:tcPr>
+            <w:tcW w:type="dxa" w:w="2600"/>
+            <w:tcBorders>
+              <w:top w:val="single" w:color="B9C6E8" w:sz="6"/>
+              <w:left w:val="single" w:color="B9C6E8" w:sz="6"/>
+              <w:bottom w:val="single" w:color="B9C6E8" w:sz="6"/>
+              <w:right w:val="single" w:color="B9C6E8" w:sz="6"/>
+            </w:tcBorders>
+            <w:shd w:fill="F4F7FD" w:color="auto" w:val="clear"/>
+            <w:tcMar>
+              <w:top w:type="dxa" w:w="70"/>
+              <w:left w:type="dxa" w:w="110"/>
+              <w:bottom w:type="dxa" w:w="70"/>
+              <w:right w:type="dxa" w:w="110"/>
+            </w:tcMar>
+            <w:vAlign w:val="center"/>
+          </w:tcPr>
+          <w:p>
+            <w:pPr>
+              <w:spacing w:after="0" w:before="0"/>
+            </w:pPr>
+            <w:r>
+              <w:rPr>
+                <w:rFonts w:ascii="Calibri" w:cs="Calibri" w:eastAsia="Calibri" w:hAnsi="Calibri"/>
+                <w:b/>
+                <w:bCs/>
+                <w:color w:val="000000"/>
+                <w:sz w:val="20"/>
+                <w:szCs w:val="20"/>
+              </w:rPr>
+              <w:t xml:space="preserve">Vorgehen</w:t>
+            </w:r>
+          </w:p>
+        </w:tc>
+        <w:tc>
+          <w:tcPr>
+            <w:tcW w:type="dxa" w:w="7606"/>
+            <w:tcBorders>
+              <w:top w:val="single" w:color="B9C6E8" w:sz="6"/>
+              <w:left w:val="single" w:color="B9C6E8" w:sz="6"/>
+              <w:bottom w:val="single" w:color="B9C6E8" w:sz="6"/>
+              <w:right w:val="single" w:color="B9C6E8" w:sz="6"/>
+            </w:tcBorders>
+            <w:tcMar>
+              <w:top w:type="dxa" w:w="70"/>
+              <w:left w:type="dxa" w:w="110"/>
+              <w:bottom w:type="dxa" w:w="70"/>
+              <w:right w:type="dxa" w:w="110"/>
+            </w:tcMar>
+            <w:vAlign w:val="center"/>
+          </w:tcPr>
+          <w:p>
+            <w:pPr>
+              <w:spacing w:after="0" w:before="0"/>
+            </w:pPr>
+            <w:r>
+              <w:rPr>
+                <w:rFonts w:ascii="Calibri" w:cs="Calibri" w:eastAsia="Calibri" w:hAnsi="Calibri"/>
+                <w:color w:val="000000"/>
+                <w:sz w:val="20"/>
+                <w:szCs w:val="20"/>
+              </w:rPr>
+              <w:t xml:space="preserve">Direktes Vorgehen in Phase 1 bis 2 (Vorwissen gering, Zahlen und Regel werden vorgegeben), Öffnung in Phase 3 (Spiel) erst nach dem Modell. Direkt oder indirekt wird je Phase entschieden.</w:t>
+            </w:r>
+          </w:p>
+        </w:tc>
+      </w:tr>
+    </w:tbl>
     <w:p>
       <w:pPr>
         <w:keepNext/>
@@ -2432,6 +2831,112 @@
           <w:szCs w:val="18"/>
         </w:rPr>
         <w:t xml:space="preserve">   AVIVA: Ankommen</w:t>
+      </w:r>
+    </w:p>
+    <w:tbl>
+      <w:tblPr>
+        <w:tblW w:type="dxa" w:w="10186"/>
+        <w:tblBorders>
+          <w:top w:val="single" w:color="auto" w:sz="4"/>
+          <w:left w:val="single" w:color="auto" w:sz="4"/>
+          <w:bottom w:val="single" w:color="auto" w:sz="4"/>
+          <w:right w:val="single" w:color="auto" w:sz="4"/>
+          <w:insideH w:val="single" w:color="auto" w:sz="4"/>
+          <w:insideV w:val="single" w:color="auto" w:sz="4"/>
+        </w:tblBorders>
+      </w:tblPr>
+      <w:tblGrid>
+        <w:gridCol w:w="10186"/>
+      </w:tblGrid>
+      <w:tr>
+        <w:trPr>
+          <w:cantSplit/>
+        </w:trPr>
+        <w:tc>
+          <w:tcPr>
+            <w:tcW w:type="dxa" w:w="10186"/>
+            <w:tcBorders>
+              <w:top w:val="single" w:color="B9C6E8" w:sz="6"/>
+              <w:left w:val="single" w:color="B9C6E8" w:sz="6"/>
+              <w:bottom w:val="single" w:color="B9C6E8" w:sz="6"/>
+              <w:right w:val="single" w:color="B9C6E8" w:sz="6"/>
+            </w:tcBorders>
+            <w:shd w:fill="EAF0FA" w:color="auto" w:val="clear"/>
+            <w:tcMar>
+              <w:top w:type="dxa" w:w="70"/>
+              <w:left w:type="dxa" w:w="110"/>
+              <w:bottom w:type="dxa" w:w="70"/>
+              <w:right w:type="dxa" w:w="110"/>
+            </w:tcMar>
+            <w:vAlign w:val="center"/>
+          </w:tcPr>
+          <w:p>
+            <w:pPr>
+              <w:spacing w:after="40" w:before="0"/>
+            </w:pPr>
+            <w:r>
+              <w:rPr>
+                <w:rFonts w:ascii="Calibri" w:cs="Calibri" w:eastAsia="Calibri" w:hAnsi="Calibri"/>
+                <w:b/>
+                <w:bCs/>
+                <w:color w:val="1E2761"/>
+                <w:sz w:val="19"/>
+                <w:szCs w:val="19"/>
+              </w:rPr>
+              <w:t xml:space="preserve">Warum  </w:t>
+            </w:r>
+            <w:r>
+              <w:rPr>
+                <w:rFonts w:ascii="Calibri" w:cs="Calibri" w:eastAsia="Calibri" w:hAnsi="Calibri"/>
+                <w:color w:val="000000"/>
+                <w:sz w:val="19"/>
+                <w:szCs w:val="19"/>
+              </w:rPr>
+              <w:t xml:space="preserve">Die Klasse wird ruhig, kennt Ziel und Ablauf und weiß, was am Ende gekonnt werden soll (direkt, von der Lehrkraft geführt).</w:t>
+            </w:r>
+          </w:p>
+          <w:p>
+            <w:pPr>
+              <w:spacing w:after="0" w:before="0"/>
+            </w:pPr>
+            <w:r>
+              <w:rPr>
+                <w:rFonts w:ascii="Calibri" w:cs="Calibri" w:eastAsia="Calibri" w:hAnsi="Calibri"/>
+                <w:b/>
+                <w:bCs/>
+                <w:color w:val="1E2761"/>
+                <w:sz w:val="19"/>
+                <w:szCs w:val="19"/>
+              </w:rPr>
+              <w:t xml:space="preserve">Gelenk  </w:t>
+            </w:r>
+            <w:r>
+              <w:rPr>
+                <w:rFonts w:ascii="Calibri" w:cs="Calibri" w:eastAsia="Calibri" w:hAnsi="Calibri"/>
+                <w:i/>
+                <w:iCs/>
+                <w:color w:val="000000"/>
+                <w:sz w:val="19"/>
+                <w:szCs w:val="19"/>
+              </w:rPr>
+              <w:t xml:space="preserve">„Zuerst schauen wir, was ihr aus dem Absolutismus noch wisst, denn das braucht ihr gleich.“</w:t>
+            </w:r>
+          </w:p>
+        </w:tc>
+      </w:tr>
+    </w:tbl>
+    <w:p>
+      <w:pPr>
+        <w:spacing w:after="20" w:before="0"/>
+      </w:pPr>
+      <w:r>
+        <w:rPr>
+          <w:rFonts w:ascii="Calibri" w:cs="Calibri" w:eastAsia="Calibri" w:hAnsi="Calibri"/>
+          <w:color w:val="000000"/>
+          <w:sz w:val="22"/>
+          <w:szCs w:val="22"/>
+        </w:rPr>
+        <w:t xml:space="preserve"/>
       </w:r>
     </w:p>
     <w:tbl>
@@ -2780,6 +3285,112 @@
     </w:p>
     <w:tbl>
       <w:tblPr>
+        <w:tblW w:type="dxa" w:w="10186"/>
+        <w:tblBorders>
+          <w:top w:val="single" w:color="auto" w:sz="4"/>
+          <w:left w:val="single" w:color="auto" w:sz="4"/>
+          <w:bottom w:val="single" w:color="auto" w:sz="4"/>
+          <w:right w:val="single" w:color="auto" w:sz="4"/>
+          <w:insideH w:val="single" w:color="auto" w:sz="4"/>
+          <w:insideV w:val="single" w:color="auto" w:sz="4"/>
+        </w:tblBorders>
+      </w:tblPr>
+      <w:tblGrid>
+        <w:gridCol w:w="10186"/>
+      </w:tblGrid>
+      <w:tr>
+        <w:trPr>
+          <w:cantSplit/>
+        </w:trPr>
+        <w:tc>
+          <w:tcPr>
+            <w:tcW w:type="dxa" w:w="10186"/>
+            <w:tcBorders>
+              <w:top w:val="single" w:color="B9C6E8" w:sz="6"/>
+              <w:left w:val="single" w:color="B9C6E8" w:sz="6"/>
+              <w:bottom w:val="single" w:color="B9C6E8" w:sz="6"/>
+              <w:right w:val="single" w:color="B9C6E8" w:sz="6"/>
+            </w:tcBorders>
+            <w:shd w:fill="EAF0FA" w:color="auto" w:val="clear"/>
+            <w:tcMar>
+              <w:top w:type="dxa" w:w="70"/>
+              <w:left w:type="dxa" w:w="110"/>
+              <w:bottom w:type="dxa" w:w="70"/>
+              <w:right w:type="dxa" w:w="110"/>
+            </w:tcMar>
+            <w:vAlign w:val="center"/>
+          </w:tcPr>
+          <w:p>
+            <w:pPr>
+              <w:spacing w:after="40" w:before="0"/>
+            </w:pPr>
+            <w:r>
+              <w:rPr>
+                <w:rFonts w:ascii="Calibri" w:cs="Calibri" w:eastAsia="Calibri" w:hAnsi="Calibri"/>
+                <w:b/>
+                <w:bCs/>
+                <w:color w:val="1E2761"/>
+                <w:sz w:val="19"/>
+                <w:szCs w:val="19"/>
+              </w:rPr>
+              <w:t xml:space="preserve">Warum  </w:t>
+            </w:r>
+            <w:r>
+              <w:rPr>
+                <w:rFonts w:ascii="Calibri" w:cs="Calibri" w:eastAsia="Calibri" w:hAnsi="Calibri"/>
+                <w:color w:val="000000"/>
+                <w:sz w:val="19"/>
+                <w:szCs w:val="19"/>
+              </w:rPr>
+              <w:t xml:space="preserve">Zahlen und Vorrechte der drei Stände aktiv abrufen, denn ohne sie ist die Abstimmung im Spiel nicht zu verstehen (direkt: erst allein, Kontrolle per Folie).</w:t>
+            </w:r>
+          </w:p>
+          <w:p>
+            <w:pPr>
+              <w:spacing w:after="0" w:before="0"/>
+            </w:pPr>
+            <w:r>
+              <w:rPr>
+                <w:rFonts w:ascii="Calibri" w:cs="Calibri" w:eastAsia="Calibri" w:hAnsi="Calibri"/>
+                <w:b/>
+                <w:bCs/>
+                <w:color w:val="1E2761"/>
+                <w:sz w:val="19"/>
+                <w:szCs w:val="19"/>
+              </w:rPr>
+              <w:t xml:space="preserve">Gelenk  </w:t>
+            </w:r>
+            <w:r>
+              <w:rPr>
+                <w:rFonts w:ascii="Calibri" w:cs="Calibri" w:eastAsia="Calibri" w:hAnsi="Calibri"/>
+                <w:i/>
+                <w:iCs/>
+                <w:color w:val="000000"/>
+                <w:sz w:val="19"/>
+                <w:szCs w:val="19"/>
+              </w:rPr>
+              <w:t xml:space="preserve">„Klerus und Adel zahlen keine Steuern. Wie es dazu kam, dass der König ihre Zustimmung doch wieder brauchte, lest ihr jetzt.“</w:t>
+            </w:r>
+          </w:p>
+        </w:tc>
+      </w:tr>
+    </w:tbl>
+    <w:p>
+      <w:pPr>
+        <w:spacing w:after="20" w:before="0"/>
+      </w:pPr>
+      <w:r>
+        <w:rPr>
+          <w:rFonts w:ascii="Calibri" w:cs="Calibri" w:eastAsia="Calibri" w:hAnsi="Calibri"/>
+          <w:color w:val="000000"/>
+          <w:sz w:val="22"/>
+          <w:szCs w:val="22"/>
+        </w:rPr>
+        <w:t xml:space="preserve"/>
+      </w:r>
+    </w:p>
+    <w:tbl>
+      <w:tblPr>
         <w:tblW w:type="dxa" w:w="10206"/>
         <w:tblBorders>
           <w:top w:val="single" w:color="auto" w:sz="4"/>
@@ -2902,7 +3513,7 @@
                 <w:sz w:val="21"/>
                 <w:szCs w:val="21"/>
               </w:rPr>
-              <w:t xml:space="preserve">Folie 4 (Ü1). 4 Minuten schriftlich im Heft, danach Folie 5 zeigen (Lösung), 2 Minuten „Vergleicht und verbessert mit Grün.“ Kein Plenumsgespräch. Der Inhalt knüpft an die letzte Stunde an: Die Zahlen und Vorrechte brauchen die Schülerinnen und Schüler gleich im Spiel.</w:t>
+              <w:t xml:space="preserve">Folie 4 (Ü1). 4 Minuten schriftlich im Heft, danach Folie 5 zeigen (Lösung), 2 Minuten „Vergleicht und verbessert mit Grün.“ Kein Plenumsgespräch. Partnercheck nach Ü1 (1 Minute, flüstern) nur, wenn die Klasse ruhig ist; sonst entfällt er. Der Inhalt knüpft an die letzte Stunde an: Die Zahlen und Vorrechte brauchen die Schülerinnen und Schüler gleich im Spiel.</w:t>
             </w:r>
           </w:p>
           <w:tbl>
@@ -3266,6 +3877,112 @@
     </w:p>
     <w:tbl>
       <w:tblPr>
+        <w:tblW w:type="dxa" w:w="10186"/>
+        <w:tblBorders>
+          <w:top w:val="single" w:color="auto" w:sz="4"/>
+          <w:left w:val="single" w:color="auto" w:sz="4"/>
+          <w:bottom w:val="single" w:color="auto" w:sz="4"/>
+          <w:right w:val="single" w:color="auto" w:sz="4"/>
+          <w:insideH w:val="single" w:color="auto" w:sz="4"/>
+          <w:insideV w:val="single" w:color="auto" w:sz="4"/>
+        </w:tblBorders>
+      </w:tblPr>
+      <w:tblGrid>
+        <w:gridCol w:w="10186"/>
+      </w:tblGrid>
+      <w:tr>
+        <w:trPr>
+          <w:cantSplit/>
+        </w:trPr>
+        <w:tc>
+          <w:tcPr>
+            <w:tcW w:type="dxa" w:w="10186"/>
+            <w:tcBorders>
+              <w:top w:val="single" w:color="B9C6E8" w:sz="6"/>
+              <w:left w:val="single" w:color="B9C6E8" w:sz="6"/>
+              <w:bottom w:val="single" w:color="B9C6E8" w:sz="6"/>
+              <w:right w:val="single" w:color="B9C6E8" w:sz="6"/>
+            </w:tcBorders>
+            <w:shd w:fill="EAF0FA" w:color="auto" w:val="clear"/>
+            <w:tcMar>
+              <w:top w:type="dxa" w:w="70"/>
+              <w:left w:type="dxa" w:w="110"/>
+              <w:bottom w:type="dxa" w:w="70"/>
+              <w:right w:type="dxa" w:w="110"/>
+            </w:tcMar>
+            <w:vAlign w:val="center"/>
+          </w:tcPr>
+          <w:p>
+            <w:pPr>
+              <w:spacing w:after="40" w:before="0"/>
+            </w:pPr>
+            <w:r>
+              <w:rPr>
+                <w:rFonts w:ascii="Calibri" w:cs="Calibri" w:eastAsia="Calibri" w:hAnsi="Calibri"/>
+                <w:b/>
+                <w:bCs/>
+                <w:color w:val="1E2761"/>
+                <w:sz w:val="19"/>
+                <w:szCs w:val="19"/>
+              </w:rPr>
+              <w:t xml:space="preserve">Warum  </w:t>
+            </w:r>
+            <w:r>
+              <w:rPr>
+                <w:rFonts w:ascii="Calibri" w:cs="Calibri" w:eastAsia="Calibri" w:hAnsi="Calibri"/>
+                <w:color w:val="000000"/>
+                <w:sz w:val="19"/>
+                <w:szCs w:val="19"/>
+              </w:rPr>
+              <w:t xml:space="preserve">Der Verlauf bis 1789 wird selbst aus dem Text erarbeitet, damit Ursachen und Reihenfolge klar sind (indirekt: Lesen allein, Kreide-Kette als Kontrolle). Die Kreide-Kette bringt Ruhe und lässt alle mitprüfen; ein Partnervergleich vorher wäre bei dieser Klasse zu laut.</w:t>
+            </w:r>
+          </w:p>
+          <w:p>
+            <w:pPr>
+              <w:spacing w:after="0" w:before="0"/>
+            </w:pPr>
+            <w:r>
+              <w:rPr>
+                <w:rFonts w:ascii="Calibri" w:cs="Calibri" w:eastAsia="Calibri" w:hAnsi="Calibri"/>
+                <w:b/>
+                <w:bCs/>
+                <w:color w:val="1E2761"/>
+                <w:sz w:val="19"/>
+                <w:szCs w:val="19"/>
+              </w:rPr>
+              <w:t xml:space="preserve">Gelenk  </w:t>
+            </w:r>
+            <w:r>
+              <w:rPr>
+                <w:rFonts w:ascii="Calibri" w:cs="Calibri" w:eastAsia="Calibri" w:hAnsi="Calibri"/>
+                <w:i/>
+                <w:iCs/>
+                <w:color w:val="000000"/>
+                <w:sz w:val="19"/>
+                <w:szCs w:val="19"/>
+              </w:rPr>
+              <w:t xml:space="preserve">„Der König braucht Geld und ruft die Generalstände. Aber wie wird dort abgestimmt? Das erlebt ihr jetzt selbst.“</w:t>
+            </w:r>
+          </w:p>
+        </w:tc>
+      </w:tr>
+    </w:tbl>
+    <w:p>
+      <w:pPr>
+        <w:spacing w:after="20" w:before="0"/>
+      </w:pPr>
+      <w:r>
+        <w:rPr>
+          <w:rFonts w:ascii="Calibri" w:cs="Calibri" w:eastAsia="Calibri" w:hAnsi="Calibri"/>
+          <w:color w:val="000000"/>
+          <w:sz w:val="22"/>
+          <w:szCs w:val="22"/>
+        </w:rPr>
+        <w:t xml:space="preserve"/>
+      </w:r>
+    </w:p>
+    <w:tbl>
+      <w:tblPr>
         <w:tblW w:type="dxa" w:w="10206"/>
         <w:tblBorders>
           <w:top w:val="single" w:color="auto" w:sz="4"/>
@@ -4030,6 +4747,112 @@
           <w:tcPr>
             <w:tcW w:type="dxa" w:w="10186"/>
             <w:tcBorders>
+              <w:top w:val="single" w:color="B9C6E8" w:sz="6"/>
+              <w:left w:val="single" w:color="B9C6E8" w:sz="6"/>
+              <w:bottom w:val="single" w:color="B9C6E8" w:sz="6"/>
+              <w:right w:val="single" w:color="B9C6E8" w:sz="6"/>
+            </w:tcBorders>
+            <w:shd w:fill="EAF0FA" w:color="auto" w:val="clear"/>
+            <w:tcMar>
+              <w:top w:type="dxa" w:w="70"/>
+              <w:left w:type="dxa" w:w="110"/>
+              <w:bottom w:type="dxa" w:w="70"/>
+              <w:right w:type="dxa" w:w="110"/>
+            </w:tcMar>
+            <w:vAlign w:val="center"/>
+          </w:tcPr>
+          <w:p>
+            <w:pPr>
+              <w:spacing w:after="40" w:before="0"/>
+            </w:pPr>
+            <w:r>
+              <w:rPr>
+                <w:rFonts w:ascii="Calibri" w:cs="Calibri" w:eastAsia="Calibri" w:hAnsi="Calibri"/>
+                <w:b/>
+                <w:bCs/>
+                <w:color w:val="1E2761"/>
+                <w:sz w:val="19"/>
+                <w:szCs w:val="19"/>
+              </w:rPr>
+              <w:t xml:space="preserve">Warum  </w:t>
+            </w:r>
+            <w:r>
+              <w:rPr>
+                <w:rFonts w:ascii="Calibri" w:cs="Calibri" w:eastAsia="Calibri" w:hAnsi="Calibri"/>
+                <w:color w:val="000000"/>
+                <w:sz w:val="19"/>
+                <w:szCs w:val="19"/>
+              </w:rPr>
+              <w:t xml:space="preserve">Die Regel wird erst vorgesprochen und modelliert (direkt), dann erlebt die Klasse sie selbst im Spiel (indirekt, handelnd) und wertet sie schriftlich aus. So entsteht das Sachurteil „unfair, weil …“ aus eigener Erfahrung.</w:t>
+            </w:r>
+          </w:p>
+          <w:p>
+            <w:pPr>
+              <w:spacing w:after="0" w:before="0"/>
+            </w:pPr>
+            <w:r>
+              <w:rPr>
+                <w:rFonts w:ascii="Calibri" w:cs="Calibri" w:eastAsia="Calibri" w:hAnsi="Calibri"/>
+                <w:b/>
+                <w:bCs/>
+                <w:color w:val="1E2761"/>
+                <w:sz w:val="19"/>
+                <w:szCs w:val="19"/>
+              </w:rPr>
+              <w:t xml:space="preserve">Gelenk  </w:t>
+            </w:r>
+            <w:r>
+              <w:rPr>
+                <w:rFonts w:ascii="Calibri" w:cs="Calibri" w:eastAsia="Calibri" w:hAnsi="Calibri"/>
+                <w:i/>
+                <w:iCs/>
+                <w:color w:val="000000"/>
+                <w:sz w:val="19"/>
+                <w:szCs w:val="19"/>
+              </w:rPr>
+              <w:t xml:space="preserve">„Ihr habt erlebt, dass die Regel den Ausgang bestimmt. Jetzt halten wir fest, was das für Frankreich 1789 hieß.“</w:t>
+            </w:r>
+          </w:p>
+        </w:tc>
+      </w:tr>
+    </w:tbl>
+    <w:p>
+      <w:pPr>
+        <w:spacing w:after="20" w:before="0"/>
+      </w:pPr>
+      <w:r>
+        <w:rPr>
+          <w:rFonts w:ascii="Calibri" w:cs="Calibri" w:eastAsia="Calibri" w:hAnsi="Calibri"/>
+          <w:color w:val="000000"/>
+          <w:sz w:val="22"/>
+          <w:szCs w:val="22"/>
+        </w:rPr>
+        <w:t xml:space="preserve"/>
+      </w:r>
+    </w:p>
+    <w:tbl>
+      <w:tblPr>
+        <w:tblW w:type="dxa" w:w="10186"/>
+        <w:tblBorders>
+          <w:top w:val="single" w:color="auto" w:sz="4"/>
+          <w:left w:val="single" w:color="auto" w:sz="4"/>
+          <w:bottom w:val="single" w:color="auto" w:sz="4"/>
+          <w:right w:val="single" w:color="auto" w:sz="4"/>
+          <w:insideH w:val="single" w:color="auto" w:sz="4"/>
+          <w:insideV w:val="single" w:color="auto" w:sz="4"/>
+        </w:tblBorders>
+      </w:tblPr>
+      <w:tblGrid>
+        <w:gridCol w:w="10186"/>
+      </w:tblGrid>
+      <w:tr>
+        <w:trPr>
+          <w:cantSplit/>
+        </w:trPr>
+        <w:tc>
+          <w:tcPr>
+            <w:tcW w:type="dxa" w:w="10186"/>
+            <w:tcBorders>
               <w:top w:val="single" w:color="B9C6E8" w:sz="8"/>
               <w:left w:val="single" w:color="B9C6E8" w:sz="8"/>
               <w:bottom w:val="single" w:color="B9C6E8" w:sz="8"/>
@@ -4210,7 +5033,49 @@
                 <w:sz w:val="21"/>
                 <w:szCs w:val="21"/>
               </w:rPr>
-              <w:t xml:space="preserve">3a  (2 Min.) Folie 8: Antrag „Auch Adel und Klerus zahlen künftig Steuern.“ und die Regel: Jeder Stand hat eine Stimme (so war es bei den Generalständen, siehe Text). Sprechen Sie die Regel einmal vor.</w:t>
+              <w:t xml:space="preserve">3a  (3 Min., eine Minute kommt aus dem Puffer) Folie 8: Antrag „Auch Adel und Klerus zahlen künftig Steuern.“ und die Regel: Jeder Stand hat eine Stimme (so war es bei den Generalständen, siehe Text). Sprechen Sie die Regel einmal vor.</w:t>
+            </w:r>
+          </w:p>
+          <w:p>
+            <w:pPr>
+              <w:spacing w:after="50" w:before="0"/>
+            </w:pPr>
+            <w:r>
+              <w:rPr>
+                <w:rFonts w:ascii="Calibri" w:cs="Calibri" w:eastAsia="Calibri" w:hAnsi="Calibri"/>
+                <w:color w:val="000000"/>
+                <w:sz w:val="21"/>
+                <w:szCs w:val="21"/>
+              </w:rPr>
+              <w:t xml:space="preserve">Modell (30 Sekunden, laut denken): „Es gibt drei Stände, jeder hat eine Stimme. Zwei Stimmen reichen. Wenn Klerus und Adel beide Nein sagen, ist der Antrag durch, egal, was der Dritte Stand sagt.“</w:t>
+            </w:r>
+          </w:p>
+          <w:p>
+            <w:pPr>
+              <w:spacing w:after="50" w:before="0"/>
+            </w:pPr>
+            <w:r>
+              <w:rPr>
+                <w:rFonts w:ascii="Calibri" w:cs="Calibri" w:eastAsia="Calibri" w:hAnsi="Calibri"/>
+                <w:color w:val="000000"/>
+                <w:sz w:val="21"/>
+                <w:szCs w:val="21"/>
+              </w:rPr>
+              <w:t xml:space="preserve">Warnung vor dem Fehler: Viele denken, der Dritte Stand habe bei der Abstimmung nach Ständen mehr Stimmen, weil er mehr Menschen hat. Es ist eine Stimme für den ganzen Stand, nicht eine pro Person.</w:t>
+            </w:r>
+          </w:p>
+          <w:p>
+            <w:pPr>
+              <w:spacing w:after="50" w:before="0"/>
+            </w:pPr>
+            <w:r>
+              <w:rPr>
+                <w:rFonts w:ascii="Calibri" w:cs="Calibri" w:eastAsia="Calibri" w:hAnsi="Calibri"/>
+                <w:color w:val="000000"/>
+                <w:sz w:val="21"/>
+                <w:szCs w:val="21"/>
+              </w:rPr>
+              <w:t xml:space="preserve">Gezielte Abfrage (Stichprobe bei 3 Schülerinnen und Schülern unterschiedlichen Niveaus, unbenotet, getrennt von den mündlichen Noten, kein Gespräch): „Wie viele Stimmen hat der Dritte Stand?“ – „Wie viele braucht man zum Sieg?“ – „Wer hätte schon gewonnen?“ Neutral reagieren, kurz bestätigen oder korrigieren.</w:t>
             </w:r>
           </w:p>
           <w:p>
@@ -4909,6 +5774,20 @@
                 <w:sz w:val="21"/>
                 <w:szCs w:val="21"/>
               </w:rPr>
+              <w:t xml:space="preserve">Gezielte Abfrage (2 bis 3 Personen, kurz): „Warum hat der Antrag nach Ständen verloren, obwohl 18 Personen dafür waren?“ – „Was ist anders nach Köpfen?“ Das ersetzt das Gespräch.</w:t>
+            </w:r>
+          </w:p>
+          <w:p>
+            <w:pPr>
+              <w:spacing w:after="50" w:before="0"/>
+            </w:pPr>
+            <w:r>
+              <w:rPr>
+                <w:rFonts w:ascii="Calibri" w:cs="Calibri" w:eastAsia="Calibri" w:hAnsi="Calibri"/>
+                <w:color w:val="000000"/>
+                <w:sz w:val="21"/>
+                <w:szCs w:val="21"/>
+              </w:rPr>
               <w:t xml:space="preserve">Zweiter Gesprächsmoment, ebenfalls unter einer Minute: „Wer will, schreibt jetzt auf, was ihn am meisten überrascht hat.“ Keine Antworten ins Plenum.</w:t>
             </w:r>
           </w:p>
@@ -5053,7 +5932,7 @@
                 <w:sz w:val="21"/>
                 <w:szCs w:val="21"/>
               </w:rPr>
-              <w:t xml:space="preserve">3e  (4 Min., Folie 13) Ü3 im Heft: drei Sätze. Satz 3 ist mit * markiert und darf entfallen, wenn die Zeit knapp wird. Zeit angeben, nach 3 Minuten „Noch eine Minute.“</w:t>
+              <w:t xml:space="preserve">3e  (4 Min., Folie 13) Ü3 im Heft: drei Sätze. Satz 3 ist mit * markiert und darf entfallen, wenn die Zeit knapp wird. Zeit angeben, nach 3 Minuten „Noch eine Minute.“ Stichprobe im Heft: durch die Reihen gehen und bei 4 bis 6 Personen unterschiedlichen Niveaus mitlesen, nicht kommentieren. Im Wechsel mit der gezielten Abfrage einsetzbar.</w:t>
             </w:r>
           </w:p>
           <w:tbl>
@@ -5403,6 +6282,112 @@
     </w:p>
     <w:tbl>
       <w:tblPr>
+        <w:tblW w:type="dxa" w:w="10186"/>
+        <w:tblBorders>
+          <w:top w:val="single" w:color="auto" w:sz="4"/>
+          <w:left w:val="single" w:color="auto" w:sz="4"/>
+          <w:bottom w:val="single" w:color="auto" w:sz="4"/>
+          <w:right w:val="single" w:color="auto" w:sz="4"/>
+          <w:insideH w:val="single" w:color="auto" w:sz="4"/>
+          <w:insideV w:val="single" w:color="auto" w:sz="4"/>
+        </w:tblBorders>
+      </w:tblPr>
+      <w:tblGrid>
+        <w:gridCol w:w="10186"/>
+      </w:tblGrid>
+      <w:tr>
+        <w:trPr>
+          <w:cantSplit/>
+        </w:trPr>
+        <w:tc>
+          <w:tcPr>
+            <w:tcW w:type="dxa" w:w="10186"/>
+            <w:tcBorders>
+              <w:top w:val="single" w:color="B9C6E8" w:sz="6"/>
+              <w:left w:val="single" w:color="B9C6E8" w:sz="6"/>
+              <w:bottom w:val="single" w:color="B9C6E8" w:sz="6"/>
+              <w:right w:val="single" w:color="B9C6E8" w:sz="6"/>
+            </w:tcBorders>
+            <w:shd w:fill="EAF0FA" w:color="auto" w:val="clear"/>
+            <w:tcMar>
+              <w:top w:type="dxa" w:w="70"/>
+              <w:left w:type="dxa" w:w="110"/>
+              <w:bottom w:type="dxa" w:w="70"/>
+              <w:right w:type="dxa" w:w="110"/>
+            </w:tcMar>
+            <w:vAlign w:val="center"/>
+          </w:tcPr>
+          <w:p>
+            <w:pPr>
+              <w:spacing w:after="40" w:before="0"/>
+            </w:pPr>
+            <w:r>
+              <w:rPr>
+                <w:rFonts w:ascii="Calibri" w:cs="Calibri" w:eastAsia="Calibri" w:hAnsi="Calibri"/>
+                <w:b/>
+                <w:bCs/>
+                <w:color w:val="1E2761"/>
+                <w:sz w:val="19"/>
+                <w:szCs w:val="19"/>
+              </w:rPr>
+              <w:t xml:space="preserve">Warum  </w:t>
+            </w:r>
+            <w:r>
+              <w:rPr>
+                <w:rFonts w:ascii="Calibri" w:cs="Calibri" w:eastAsia="Calibri" w:hAnsi="Calibri"/>
+                <w:color w:val="000000"/>
+                <w:sz w:val="19"/>
+                <w:szCs w:val="19"/>
+              </w:rPr>
+              <w:t xml:space="preserve">Der Lernzuwachs wird gesichert und überprüft: Merksatz, Lernziele, „Heute habe ich gelernt, …“. Diese Phase wird nie gestrichen.</w:t>
+            </w:r>
+          </w:p>
+          <w:p>
+            <w:pPr>
+              <w:spacing w:after="0" w:before="0"/>
+            </w:pPr>
+            <w:r>
+              <w:rPr>
+                <w:rFonts w:ascii="Calibri" w:cs="Calibri" w:eastAsia="Calibri" w:hAnsi="Calibri"/>
+                <w:b/>
+                <w:bCs/>
+                <w:color w:val="1E2761"/>
+                <w:sz w:val="19"/>
+                <w:szCs w:val="19"/>
+              </w:rPr>
+              <w:t xml:space="preserve">Gelenk  </w:t>
+            </w:r>
+            <w:r>
+              <w:rPr>
+                <w:rFonts w:ascii="Calibri" w:cs="Calibri" w:eastAsia="Calibri" w:hAnsi="Calibri"/>
+                <w:i/>
+                <w:iCs/>
+                <w:color w:val="000000"/>
+                <w:sz w:val="19"/>
+                <w:szCs w:val="19"/>
+              </w:rPr>
+              <w:t xml:space="preserve">„Nächste Stunde: Was macht der Dritte Stand, wenn er überstimmt wird?“</w:t>
+            </w:r>
+          </w:p>
+        </w:tc>
+      </w:tr>
+    </w:tbl>
+    <w:p>
+      <w:pPr>
+        <w:spacing w:after="20" w:before="0"/>
+      </w:pPr>
+      <w:r>
+        <w:rPr>
+          <w:rFonts w:ascii="Calibri" w:cs="Calibri" w:eastAsia="Calibri" w:hAnsi="Calibri"/>
+          <w:color w:val="000000"/>
+          <w:sz w:val="22"/>
+          <w:szCs w:val="22"/>
+        </w:rPr>
+        <w:t xml:space="preserve"/>
+      </w:r>
+    </w:p>
+    <w:tbl>
+      <w:tblPr>
         <w:tblW w:type="dxa" w:w="10206"/>
         <w:tblBorders>
           <w:top w:val="single" w:color="auto" w:sz="4"/>
@@ -6208,6 +7193,119 @@
         </w:tc>
       </w:tr>
     </w:tbl>
+    <w:p>
+      <w:pPr>
+        <w:keepNext/>
+        <w:spacing w:after="60" w:before="160"/>
+      </w:pPr>
+      <w:r>
+        <w:rPr>
+          <w:rFonts w:ascii="Cambria" w:cs="Cambria" w:eastAsia="Cambria" w:hAnsi="Cambria"/>
+          <w:b/>
+          <w:bCs/>
+          <w:color w:val="1E2761"/>
+          <w:sz w:val="24"/>
+          <w:szCs w:val="24"/>
+        </w:rPr>
+        <w:t xml:space="preserve">Nach der Stunde festhalten (Reflexionslog)</w:t>
+      </w:r>
+    </w:p>
+    <w:p>
+      <w:pPr>
+        <w:spacing w:after="40" w:before="0"/>
+        <w:ind w:left="240"/>
+      </w:pPr>
+      <w:r>
+        <w:rPr>
+          <w:rFonts w:ascii="Calibri" w:cs="Calibri" w:eastAsia="Calibri" w:hAnsi="Calibri"/>
+          <w:color w:val="000000"/>
+          <w:sz w:val="21"/>
+          <w:szCs w:val="21"/>
+        </w:rPr>
+        <w:t xml:space="preserve">• </w:t>
+      </w:r>
+      <w:r>
+        <w:rPr>
+          <w:rFonts w:ascii="Calibri" w:cs="Calibri" w:eastAsia="Calibri" w:hAnsi="Calibri"/>
+          <w:color w:val="000000"/>
+          <w:sz w:val="21"/>
+          <w:szCs w:val="21"/>
+        </w:rPr>
+        <w:t xml:space="preserve">Passten Ziel, Inhalt und Methode zusammen? Wie lief die Zeit? Wie viel echte Lernzeit hatte die Klasse?</w:t>
+      </w:r>
+    </w:p>
+    <w:p>
+      <w:pPr>
+        <w:spacing w:after="40" w:before="0"/>
+        <w:ind w:left="240"/>
+      </w:pPr>
+      <w:r>
+        <w:rPr>
+          <w:rFonts w:ascii="Calibri" w:cs="Calibri" w:eastAsia="Calibri" w:hAnsi="Calibri"/>
+          <w:color w:val="000000"/>
+          <w:sz w:val="21"/>
+          <w:szCs w:val="21"/>
+        </w:rPr>
+        <w:t xml:space="preserve">• </w:t>
+      </w:r>
+      <w:r>
+        <w:rPr>
+          <w:rFonts w:ascii="Calibri" w:cs="Calibri" w:eastAsia="Calibri" w:hAnsi="Calibri"/>
+          <w:color w:val="000000"/>
+          <w:sz w:val="21"/>
+          <w:szCs w:val="21"/>
+        </w:rPr>
+        <w:t xml:space="preserve">Wo wurde es laut, und welche Ansage half? Welche Abfrage funktionierte, welche nicht?</w:t>
+      </w:r>
+    </w:p>
+    <w:p>
+      <w:pPr>
+        <w:spacing w:after="40" w:before="0"/>
+        <w:ind w:left="240"/>
+      </w:pPr>
+      <w:r>
+        <w:rPr>
+          <w:rFonts w:ascii="Calibri" w:cs="Calibri" w:eastAsia="Calibri" w:hAnsi="Calibri"/>
+          <w:color w:val="000000"/>
+          <w:sz w:val="21"/>
+          <w:szCs w:val="21"/>
+        </w:rPr>
+        <w:t xml:space="preserve">• </w:t>
+      </w:r>
+      <w:r>
+        <w:rPr>
+          <w:rFonts w:ascii="Calibri" w:cs="Calibri" w:eastAsia="Calibri" w:hAnsi="Calibri"/>
+          <w:color w:val="000000"/>
+          <w:sz w:val="21"/>
+          <w:szCs w:val="21"/>
+        </w:rPr>
+        <w:t xml:space="preserve">Wie viele konnten „Heute habe ich gelernt, …“ sinnvoll beenden?</w:t>
+      </w:r>
+    </w:p>
+    <w:p>
+      <w:pPr>
+        <w:spacing w:after="40" w:before="0"/>
+        <w:ind w:left="240"/>
+      </w:pPr>
+      <w:r>
+        <w:rPr>
+          <w:rFonts w:ascii="Calibri" w:cs="Calibri" w:eastAsia="Calibri" w:hAnsi="Calibri"/>
+          <w:color w:val="000000"/>
+          <w:sz w:val="21"/>
+          <w:szCs w:val="21"/>
+        </w:rPr>
+        <w:t xml:space="preserve">• </w:t>
+      </w:r>
+      <w:r>
+        <w:rPr>
+          <w:rFonts w:ascii="Calibri" w:cs="Calibri" w:eastAsia="Calibri" w:hAnsi="Calibri"/>
+          <w:color w:val="000000"/>
+          <w:sz w:val="21"/>
+          <w:szCs w:val="21"/>
+        </w:rPr>
+        <w:t xml:space="preserve">Rückmeldung der Klasse: ein Satz im Heft „Das war klar / Das hat gefehlt“ (nur falls Zeit).</w:t>
+      </w:r>
+    </w:p>
     <w:p>
       <w:pPr>
         <w:keepNext/>

</xml_diff>

<commit_message>
Abschluss: konkrete Abschlussaufgabe statt "Heute habe ich gelernt" (8D Generalstände, CLAUDE.md)
Co-Authored-By: Claude Sonnet 5.5 <noreply@anthropic.com>
Claude-Session: https://claude.ai/code/session_01GXwmzpsaCraifErTDddPwN
</commit_message>
<xml_diff>
--- a/Geschichte_8D/Generalstaende/Tafelskript_Generalstaende_8D.docx
+++ b/Geschichte_8D/Generalstaende/Tafelskript_Generalstaende_8D.docx
@@ -222,7 +222,7 @@
                 <w:sz w:val="20"/>
                 <w:szCs w:val="20"/>
               </w:rPr>
-              <w:t xml:space="preserve">Zeitstrahl ausgefüllt (Ziel 1). Ü3 Satz 1 und 2 (Ziel 2). Ü3 Satz 3 mit einer Zahl (Ziel 3). „Heute habe ich gelernt, …“ im Heft.</w:t>
+              <w:t xml:space="preserve">Zeitstrahl ausgefüllt (Ziel 1). Ü3 Satz 1 und 2 (Ziel 2). Ü3 Satz 3 mit einer Zahl (Ziel 3). Abschlussaufgabe im Heft (zwei Ereignisse mit Jahr, ein Erklärsatz zum Überstimmen).</w:t>
             </w:r>
           </w:p>
         </w:tc>
@@ -1399,7 +1399,7 @@
                 <w:sz w:val="20"/>
                 <w:szCs w:val="20"/>
               </w:rPr>
-              <w:t xml:space="preserve">4  Merksatz, „Heute habe ich gelernt“, Ausblick</w:t>
+              <w:t xml:space="preserve">4  Merksatz, Abschlussaufgabe, Ausblick</w:t>
             </w:r>
           </w:p>
         </w:tc>
@@ -4668,7 +4668,7 @@
                 <w:sz w:val="19"/>
                 <w:szCs w:val="19"/>
               </w:rPr>
-              <w:t xml:space="preserve">Die Frage „Warum ruft der König die Generalstände ein, obwohl er sie 175 Jahre nicht brauchte?“ nicht ins Plenum stellen, sie steht im Text als Aufgabe 3 und wird in Phase 4 beantwortet (Satz „Heute habe ich gelernt …“). Antwort: Er braucht Geld, die Privilegierten blockieren Steuern, dazu kommen Hunger und drohender Bankrott.</w:t>
+              <w:t xml:space="preserve">Die Frage „Warum ruft der König die Generalstände ein, obwohl er sie 175 Jahre nicht brauchte?“ nicht ins Plenum stellen, sie steht im Text als Aufgabe 3 und kann bei Zeit schriftlich im Heft beantwortet werden (*), nicht im Plenum. Antwort: Er braucht Geld, die Privilegierten blockieren Steuern, dazu kommen Hunger und drohender Bankrott.</w:t>
             </w:r>
           </w:p>
         </w:tc>
@@ -6224,7 +6224,7 @@
                 <w:sz w:val="19"/>
                 <w:szCs w:val="19"/>
               </w:rPr>
-              <w:t xml:space="preserve">Wenn die Zeit knapp wird, entfällt Satz 3 (*). Phase 3d bleibt, Phase 4 wird dann auf Merksatz und „Heute habe ich gelernt“ gekürzt. Satz 3 kann in der nächsten Stunde als Wiederholung wieder aufgegriffen werden.</w:t>
+              <w:t xml:space="preserve">Wenn die Zeit knapp wird, entfällt Satz 3 (*). Phase 3d bleibt, Phase 4 wird dann auf Merksatz und Abschlussaufgabe gekürzt. Satz 3 kann in der nächsten Stunde als Wiederholung wieder aufgegriffen werden.</w:t>
             </w:r>
           </w:p>
         </w:tc>
@@ -6339,7 +6339,7 @@
                 <w:sz w:val="19"/>
                 <w:szCs w:val="19"/>
               </w:rPr>
-              <w:t xml:space="preserve">Der Lernzuwachs wird gesichert und überprüft: Merksatz, Lernziele, „Heute habe ich gelernt, …“. Diese Phase wird nie gestrichen.</w:t>
+              <w:t xml:space="preserve">Der Lernzuwachs wird gesichert und überprüft: Merksatz, Lernziele, Abschlussaufgabe zu den Zielen. Diese Phase wird nie gestrichen.</w:t>
             </w:r>
           </w:p>
           <w:p>
@@ -6524,7 +6524,7 @@
                 <w:sz w:val="21"/>
                 <w:szCs w:val="21"/>
               </w:rPr>
-              <w:t xml:space="preserve">Folie 15 (2 Minuten): Lernziele prüfen (still). Dann schreiben alle in einem Satz ins Heft: „Heute habe ich gelernt, …“.</w:t>
+              <w:t xml:space="preserve">Folie 15 (2 Minuten): Lernziele prüfen (still), dann Abschlussaufgabe allein im Heft: (1) Nenne zwei Ereignisse bis zu den Generalständen, mit Jahr. (2) Erkläre in einem Satz, warum der Dritte Stand (Bauern und Bürger) überstimmt wurde, obwohl er fast alle Menschen vertrat. Stichprobe im Heft bei 4 bis 6 Schülerinnen und Schülern, nicht kommentieren (unbenotet).</w:t>
             </w:r>
           </w:p>
           <w:p>
@@ -6563,7 +6563,7 @@
                 <w:sz w:val="19"/>
                 <w:szCs w:val="19"/>
               </w:rPr>
-              <w:t xml:space="preserve">Z. B. „Heute habe ich gelernt, dass bei den Generalständen jeder Stand nur eine Stimme hatte und Klerus und Adel den Dritten Stand überstimmen konnten, obwohl er fast alle Menschen vertrat.“</w:t>
+              <w:t xml:space="preserve">Zu (1): z. B. 1614 letzte Generalstände, 1787 Steuerplan scheitert, 1788 Missernte, August 1788 Ankündigung, 5. Mai 1789 Eröffnung. Zu (2): Bei der Abstimmung nach Ständen hat jeder Stand eine Stimme. Klerus und Adel haben zwei von drei Stimmen und sprechen sich ab, deshalb überstimmen sie den Dritten Stand (Bauern und Bürger), obwohl er fast alle Menschen vertritt.</w:t>
             </w:r>
           </w:p>
         </w:tc>
@@ -7155,7 +7155,7 @@
                 <w:sz w:val="20"/>
                 <w:szCs w:val="20"/>
               </w:rPr>
-              <w:t xml:space="preserve">Lernzuwachs</w:t>
+              <w:t xml:space="preserve">Abschlussaufgabe</w:t>
             </w:r>
           </w:p>
         </w:tc>
@@ -7187,7 +7187,7 @@
                 <w:sz w:val="20"/>
                 <w:szCs w:val="20"/>
               </w:rPr>
-              <w:t xml:space="preserve">„Heute habe ich gelernt, …“</w:t>
+              <w:t xml:space="preserve">Zwei Ereignisse mit Jahr, ein Erklärsatz zum Überstimmen</w:t>
             </w:r>
           </w:p>
         </w:tc>
@@ -7279,7 +7279,7 @@
           <w:sz w:val="21"/>
           <w:szCs w:val="21"/>
         </w:rPr>
-        <w:t xml:space="preserve">Wie viele konnten „Heute habe ich gelernt, …“ sinnvoll beenden?</w:t>
+        <w:t xml:space="preserve">Wie viele konnten die Abschlussaufgabe richtig lösen (Stichprobe im Heft)?</w:t>
       </w:r>
     </w:p>
     <w:p>

</xml_diff>

<commit_message>
Generalstände 8D: offene Abschlussfrage im Berater-Format, Form variabel; Orientierung in Sequenz und CLAUDE.md
Co-Authored-By: Claude Sonnet 5.5 <noreply@anthropic.com>
Claude-Session: https://claude.ai/code/session_01GXwmzpsaCraifErTDddPwN
</commit_message>
<xml_diff>
--- a/Geschichte_8D/Generalstaende/Tafelskript_Generalstaende_8D.docx
+++ b/Geschichte_8D/Generalstaende/Tafelskript_Generalstaende_8D.docx
@@ -222,7 +222,7 @@
                 <w:sz w:val="20"/>
                 <w:szCs w:val="20"/>
               </w:rPr>
-              <w:t xml:space="preserve">Zeitstrahl ausgefüllt (Ziel 1). Ü3 Satz 1 und 2 (Ziel 2). Ü3 Satz 3 mit einer Zahl (Ziel 3). Abschlussaufgabe im Heft (zwei Ereignisse mit Jahr, ein Erklärsatz zum Überstimmen).</w:t>
+              <w:t xml:space="preserve">Zeitstrahl ausgefüllt (Ziel 1). Ü3 Satz 1 und 2 (Ziel 2). Ü3 Satz 3 mit einer Zahl (Ziel 3). offene Abschlussfrage (Rat an den König mit Position, Sachargument und „weil“); Zeitstrahl (Ziel 1) und Ü3 Satz 1 und 2 (Ziel 2) sichern die Fakten.</w:t>
             </w:r>
           </w:p>
         </w:tc>
@@ -1189,7 +1189,7 @@
                 <w:sz w:val="20"/>
                 <w:szCs w:val="20"/>
               </w:rPr>
-              <w:t xml:space="preserve">17</w:t>
+              <w:t xml:space="preserve">18</w:t>
             </w:r>
           </w:p>
         </w:tc>
@@ -1331,7 +1331,7 @@
                 <w:sz w:val="20"/>
                 <w:szCs w:val="20"/>
               </w:rPr>
-              <w:t xml:space="preserve">5</w:t>
+              <w:t xml:space="preserve">6</w:t>
             </w:r>
           </w:p>
         </w:tc>
@@ -1399,7 +1399,7 @@
                 <w:sz w:val="20"/>
                 <w:szCs w:val="20"/>
               </w:rPr>
-              <w:t xml:space="preserve">4  Merksatz, Abschlussaufgabe, Ausblick</w:t>
+              <w:t xml:space="preserve">4  Merksatz, Abschlussfrage (Berater), Ausblick</w:t>
             </w:r>
           </w:p>
         </w:tc>
@@ -1473,7 +1473,7 @@
                 <w:sz w:val="20"/>
                 <w:szCs w:val="20"/>
               </w:rPr>
-              <w:t xml:space="preserve">3</w:t>
+              <w:t xml:space="preserve">1</w:t>
             </w:r>
           </w:p>
         </w:tc>
@@ -4710,7 +4710,7 @@
           <w:sz w:val="20"/>
           <w:szCs w:val="20"/>
         </w:rPr>
-        <w:t xml:space="preserve">   17 Min.</w:t>
+        <w:t xml:space="preserve">   18 Min.</w:t>
       </w:r>
       <w:r>
         <w:rPr>
@@ -5033,7 +5033,7 @@
                 <w:sz w:val="21"/>
                 <w:szCs w:val="21"/>
               </w:rPr>
-              <w:t xml:space="preserve">3a  (3 Min., eine Minute kommt aus dem Puffer) Folie 8: Antrag „Auch Adel und Klerus zahlen künftig Steuern.“ und die Regel: Jeder Stand hat eine Stimme (so war es bei den Generalständen, siehe Text). Sprechen Sie die Regel einmal vor.</w:t>
+              <w:t xml:space="preserve">3a  (3 Min.) Folie 8: Antrag „Auch Adel und Klerus zahlen künftig Steuern.“ und die Regel: Jeder Stand hat eine Stimme (so war es bei den Generalständen, siehe Text). Sprechen Sie die Regel einmal vor.</w:t>
             </w:r>
           </w:p>
           <w:p>
@@ -6224,7 +6224,7 @@
                 <w:sz w:val="19"/>
                 <w:szCs w:val="19"/>
               </w:rPr>
-              <w:t xml:space="preserve">Wenn die Zeit knapp wird, entfällt Satz 3 (*). Phase 3d bleibt, Phase 4 wird dann auf Merksatz und Abschlussaufgabe gekürzt. Satz 3 kann in der nächsten Stunde als Wiederholung wieder aufgegriffen werden.</w:t>
+              <w:t xml:space="preserve">Wenn die Zeit knapp wird, entfällt Satz 3 (*). Phase 3d bleibt, Phase 4 wird dann auf Merksatz und Abschlussfrage gekürzt. Satz 3 kann in der nächsten Stunde als Wiederholung wieder aufgegriffen werden.</w:t>
             </w:r>
           </w:p>
         </w:tc>
@@ -6266,7 +6266,7 @@
           <w:sz w:val="20"/>
           <w:szCs w:val="20"/>
         </w:rPr>
-        <w:t xml:space="preserve">   5 Min.</w:t>
+        <w:t xml:space="preserve">   6 Min.</w:t>
       </w:r>
       <w:r>
         <w:rPr>
@@ -6339,7 +6339,7 @@
                 <w:sz w:val="19"/>
                 <w:szCs w:val="19"/>
               </w:rPr>
-              <w:t xml:space="preserve">Der Lernzuwachs wird gesichert und überprüft: Merksatz, Lernziele, Abschlussaufgabe zu den Zielen. Diese Phase wird nie gestrichen.</w:t>
+              <w:t xml:space="preserve">Der Lernzuwachs wird gesichert und überprüft: Merksatz, Lernziele, offene Abschlussfrage, die ein Urteil mit Sachargument verlangt (Vorstufe zu den Urteilsaufgaben der Reihe). Diese Phase wird nie gestrichen.</w:t>
             </w:r>
           </w:p>
           <w:p>
@@ -6524,7 +6524,21 @@
                 <w:sz w:val="21"/>
                 <w:szCs w:val="21"/>
               </w:rPr>
-              <w:t xml:space="preserve">Folie 15 (2 Minuten): Lernziele prüfen (still), dann Abschlussaufgabe allein im Heft: (1) Nenne zwei Ereignisse bis zu den Generalständen, mit Jahr. (2) Erkläre in einem Satz, warum der Dritte Stand (Bauern und Bürger) überstimmt wurde, obwohl er fast alle Menschen vertrat. Stichprobe im Heft bei 4 bis 6 Schülerinnen und Schülern, nicht kommentieren (unbenotet).</w:t>
+              <w:t xml:space="preserve">Folie 15 (3 Minuten): Lernziele still prüfen, dann die Abschlussfrage: „Du bist Berater von König Ludwig XVI. Er fragt dich: Soll ich erlauben, dass der Dritte Stand (Bauern und Bürger) nach Köpfen abstimmt?“ Rat im Heft: „Ich rate dir, …, weil …“. Es gibt mehrere gute Antworten, geprüft werden Position, ein Sachargument aus der Stunde und ein „weil“. Erst zehn Sekunden denken, dann schreiben.</w:t>
+            </w:r>
+          </w:p>
+          <w:p>
+            <w:pPr>
+              <w:spacing w:after="50" w:before="0"/>
+            </w:pPr>
+            <w:r>
+              <w:rPr>
+                <w:rFonts w:ascii="Calibri" w:cs="Calibri" w:eastAsia="Calibri" w:hAnsi="Calibri"/>
+                <w:color w:val="000000"/>
+                <w:sz w:val="21"/>
+                <w:szCs w:val="21"/>
+              </w:rPr>
+              <w:t xml:space="preserve">Form nach Verlauf wählen: (a) Blitzlicht: je eine Stimme „erlauben“ und eine „nicht erlauben“ gezielt aufrufen, kein Kommentar (wenig Zeit, Klasse hört gut zu). (b) Schriftlich, dann zwei bis drei Sätze vorlesen (Klasse unruhig, Heft-Stichprobe bei 4 bis 6 Personen). (c) Berater-Duell zu zweit: A rät dafür, B dagegen, leise (Ruhe und Zeit). Unbenotet.</w:t>
             </w:r>
           </w:p>
           <w:p>
@@ -6563,7 +6577,7 @@
                 <w:sz w:val="19"/>
                 <w:szCs w:val="19"/>
               </w:rPr>
-              <w:t xml:space="preserve">Zu (1): z. B. 1614 letzte Generalstände, 1787 Steuerplan scheitert, 1788 Missernte, August 1788 Ankündigung, 5. Mai 1789 Eröffnung. Zu (2): Bei der Abstimmung nach Ständen hat jeder Stand eine Stimme. Klerus und Adel haben zwei von drei Stimmen und sprechen sich ab, deshalb überstimmen sie den Dritten Stand (Bauern und Bürger), obwohl er fast alle Menschen vertritt.</w:t>
+              <w:t xml:space="preserve">Mögliche Argumente (Auswahl, keine Musterlösung). Erlauben: Der Staat braucht Geld, Steuern gehen nur mit dem Dritten Stand (Bauern und Bürger); er stellt fast alle Menschen, sonst droht Unruhe; Hunger und Staatsbankrott sind nah. Nicht erlauben: Adel und Klerus sind wütend (Steuerplan 1787 gescheitert), der König verliert Rückhalt und Macht; der Dritte Stand wäre zu mächtig; seit 1614 wurde nach Ständen abgestimmt. Zwischenlösungen (erlauben, aber nur für die Steuerfrage) sind gut begründbar. Ein Hinweis, falls gefragt: Historisch lehnte der König ab. Kriterien: Position, ein Sachargument aus der Stunde, ein „weil“.</w:t>
             </w:r>
           </w:p>
         </w:tc>
@@ -7155,7 +7169,7 @@
                 <w:sz w:val="20"/>
                 <w:szCs w:val="20"/>
               </w:rPr>
-              <w:t xml:space="preserve">Abschlussaufgabe</w:t>
+              <w:t xml:space="preserve">Abschlussfrage</w:t>
             </w:r>
           </w:p>
         </w:tc>
@@ -7187,7 +7201,7 @@
                 <w:sz w:val="20"/>
                 <w:szCs w:val="20"/>
               </w:rPr>
-              <w:t xml:space="preserve">Zwei Ereignisse mit Jahr, ein Erklärsatz zum Überstimmen</w:t>
+              <w:t xml:space="preserve">Rat an den König: „Ich rate dir, …, weil …“ (Position, Sachargument, weil)</w:t>
             </w:r>
           </w:p>
         </w:tc>
@@ -7279,7 +7293,7 @@
           <w:sz w:val="21"/>
           <w:szCs w:val="21"/>
         </w:rPr>
-        <w:t xml:space="preserve">Wie viele konnten die Abschlussaufgabe richtig lösen (Stichprobe im Heft)?</w:t>
+        <w:t xml:space="preserve">Wie viele nannten in der Abschlussfrage ein Sachargument aus der Stunde (Stichprobe im Heft)? Welche Form (Blitzlicht, schriftlich, Duell) trug am besten?</w:t>
       </w:r>
     </w:p>
     <w:p>

</xml_diff>

<commit_message>
Generalstände 8D: Berater-Folie mit Zeichnungen und Sprechblasen, Ziele-Folie danach (18 Folien)
Co-Authored-By: Claude Sonnet 5.5 <noreply@anthropic.com>
Claude-Session: https://claude.ai/code/session_01GXwmzpsaCraifErTDddPwN
</commit_message>
<xml_diff>
--- a/Geschichte_8D/Generalstaende/Tafelskript_Generalstaende_8D.docx
+++ b/Geschichte_8D/Generalstaende/Tafelskript_Generalstaende_8D.docx
@@ -2780,7 +2780,7 @@
           <w:sz w:val="21"/>
           <w:szCs w:val="21"/>
         </w:rPr>
-        <w:t xml:space="preserve">Folien 1 bis 17 (Schrift mindestens 24 Punkt), Kreide, Grün zum Verbessern, ein Stapel Heftpapier für die Absprache-Zettel falls nötig.</w:t>
+        <w:t xml:space="preserve">Folien 1 bis 18 (Schrift mindestens 24 Punkt), Kreide, Grün zum Verbessern, ein Stapel Heftpapier für die Absprache-Zettel falls nötig.</w:t>
       </w:r>
     </w:p>
     <w:p>
@@ -6524,7 +6524,7 @@
                 <w:sz w:val="21"/>
                 <w:szCs w:val="21"/>
               </w:rPr>
-              <w:t xml:space="preserve">Folie 15 (3 Minuten): Lernziele still prüfen, dann die Abschlussfrage: „Du bist Berater von König Ludwig XVI. Er fragt dich: Soll ich erlauben, dass der Dritte Stand (Bauern und Bürger) nach Köpfen abstimmt?“ Rat im Heft: „Ich rate dir, …, weil …“. Es gibt mehrere gute Antworten, geprüft werden Position, ein Sachargument aus der Stunde und ein „weil“. Erst zehn Sekunden denken, dann schreiben.</w:t>
+              <w:t xml:space="preserve">Folie 15 (3 Minuten): Abschlussfrage mit Zeichnung (König Ludwig XVI. mit Sprechblase, Berater mit „Ich rate dir, …, weil …“): „Du bist Berater von König Ludwig XVI. Er fragt dich: Soll ich erlauben, dass der Dritte Stand (Bauern und Bürger) nach Köpfen abstimmt?“ Rat im Heft: „Ich rate dir, …, weil …“. Es gibt mehrere gute Antworten, geprüft werden Position, ein Sachargument aus der Stunde und ein „weil“. Erst zehn Sekunden denken, dann schreiben.</w:t>
             </w:r>
           </w:p>
           <w:p>
@@ -6552,7 +6552,7 @@
                 <w:sz w:val="21"/>
                 <w:szCs w:val="21"/>
               </w:rPr>
-              <w:t xml:space="preserve">Folie 16 (1 Minute, nur lesen): Ausblick und Hausaufgabe. „Was passiert, wenn der Dritte Stand fordert, dass nach Köpfen abgestimmt wird, und der König ablehnt? Das sehen wir in der nächsten Stunde.“ Hausaufgabe: Testaufgaben mit Grün berichtigen (falls der Test zurückgegeben wurde).</w:t>
+              <w:t xml:space="preserve">Folie 16 (30 Sekunden, still): Haben wir die Ziele erreicht? Keine Antworten ins Plenum. Folie 17 (30 Sekunden, nur lesen): Ausblick und Hausaufgabe. „Was passiert, wenn der Dritte Stand fordert, dass nach Köpfen abgestimmt wird, und der König ablehnt? Das sehen wir in der nächsten Stunde.“ Hausaufgabe: Testaufgaben mit Grün berichtigen (falls der Test zurückgegeben wurde).</w:t>
             </w:r>
           </w:p>
           <w:p>
@@ -6656,7 +6656,7 @@
                 <w:sz w:val="19"/>
                 <w:szCs w:val="19"/>
               </w:rPr>
-              <w:t xml:space="preserve">Folie 17: Sportverein-Beispiel (Übertragung): Ein Verein hat drei Abteilungen: Fußball 200 Mitglieder, Tischtennis 20, Schach 10. Jede Abteilung hat bei der Abstimmung eine Stimme. Was ist unfair? Einzelarbeit, Heft, 2 Minuten.</w:t>
+              <w:t xml:space="preserve">Folie 18: Sportverein-Beispiel (Übertragung): Ein Verein hat drei Abteilungen: Fußball 200 Mitglieder, Tischtennis 20, Schach 10. Jede Abteilung hat bei der Abstimmung eine Stimme. Was ist unfair? Einzelarbeit, Heft, 2 Minuten.</w:t>
             </w:r>
           </w:p>
         </w:tc>

</xml_diff>

<commit_message>
Generalstände 8D: Ü1 als Fehlertext (Vorwissen), Orientierung in CLAUDE.md und Sequenz
Co-Authored-By: Claude Sonnet 5.5 <noreply@anthropic.com>
Claude-Session: https://claude.ai/code/session_01GXwmzpsaCraifErTDddPwN
</commit_message>
<xml_diff>
--- a/Geschichte_8D/Generalstaende/Tafelskript_Generalstaende_8D.docx
+++ b/Geschichte_8D/Generalstaende/Tafelskript_Generalstaende_8D.docx
@@ -973,7 +973,7 @@
                 <w:sz w:val="20"/>
                 <w:szCs w:val="20"/>
               </w:rPr>
-              <w:t xml:space="preserve">1  Wiederholung: Ständegesellschaft</w:t>
+              <w:t xml:space="preserve">1  Wiederholung: Fehlertext Absolutismus und Stände</w:t>
             </w:r>
           </w:p>
         </w:tc>
@@ -3258,7 +3258,7 @@
           <w:sz w:val="28"/>
           <w:szCs w:val="28"/>
         </w:rPr>
-        <w:t xml:space="preserve">Wiederholung: Ständegesellschaft</w:t>
+        <w:t xml:space="preserve">Wiederholung: Fehlertext</w:t>
       </w:r>
       <w:r>
         <w:rPr>
@@ -3342,7 +3342,7 @@
                 <w:sz w:val="19"/>
                 <w:szCs w:val="19"/>
               </w:rPr>
-              <w:t xml:space="preserve">Zahlen und Vorrechte der drei Stände aktiv abrufen, denn ohne sie ist die Abstimmung im Spiel nicht zu verstehen (direkt: erst allein, Kontrolle per Folie).</w:t>
+              <w:t xml:space="preserve">Wissen aus dem Absolutismus-Test aktiv anwenden: Falsches erkennen und verbessern. Zahlen und Vorrechte der Stände braucht die Klasse gleich im Spiel (direkt: allein, Kontrolle per Folie). Die Generalstände kennt die Klasse noch nicht, deshalb kommen sie im Fehlertext nicht vor.</w:t>
             </w:r>
           </w:p>
           <w:p>
@@ -3513,7 +3513,7 @@
                 <w:sz w:val="21"/>
                 <w:szCs w:val="21"/>
               </w:rPr>
-              <w:t xml:space="preserve">Folie 4 (Ü1). 4 Minuten schriftlich im Heft, danach Folie 5 zeigen (Lösung), 2 Minuten „Vergleicht und verbessert mit Grün.“ Kein Plenumsgespräch. Partnercheck nach Ü1 (1 Minute, flüstern) nur, wenn die Klasse ruhig ist; sonst entfällt er. Der Inhalt knüpft an die letzte Stunde an: Die Zahlen und Vorrechte brauchen die Schülerinnen und Schüler gleich im Spiel.</w:t>
+              <w:t xml:space="preserve">Folie 4 (Ü1, Fehlertext). 4 Minuten schriftlich im Heft, danach Folie 5 zeigen (Lösung), 2 Minuten „Vergleicht und verbessert mit Grün.“ Kein Plenumsgespräch. Partnercheck nach Ü1 (1 Minute, flüstern) nur, wenn die Klasse ruhig ist; sonst entfällt er. Der Inhalt knüpft an die letzte Stunde an: Die Zahlen und Vorrechte brauchen die Schülerinnen und Schüler gleich im Spiel.</w:t>
             </w:r>
           </w:p>
           <w:tbl>
@@ -3566,7 +3566,7 @@
                       <w:sz w:val="16"/>
                       <w:szCs w:val="16"/>
                     </w:rPr>
-                    <w:t xml:space="preserve">FOLIE · 4 · Ü1 Ständegesellschaft</w:t>
+                    <w:t xml:space="preserve">FOLIE · 4 · Ü1 Fehlertext</w:t>
                   </w:r>
                 </w:p>
               </w:tc>
@@ -3606,7 +3606,7 @@
                       <w:sz w:val="22"/>
                       <w:szCs w:val="22"/>
                     </w:rPr>
-                    <w:t xml:space="preserve">Ü1 Die drei Stände</w:t>
+                    <w:t xml:space="preserve">Ü1 Absolutismus und Stände</w:t>
                   </w:r>
                 </w:p>
                 <w:p>
@@ -3620,7 +3620,7 @@
                       <w:sz w:val="20"/>
                       <w:szCs w:val="20"/>
                     </w:rPr>
-                    <w:t xml:space="preserve">1. Schreibe die drei Stände untereinander ins Heft.</w:t>
+                    <w:t xml:space="preserve">1. Ludwig XIV. war der Sonnenkönig und regierte im Absolutismus gemeinsam mit den Ständen.</w:t>
                   </w:r>
                 </w:p>
                 <w:p>
@@ -3634,7 +3634,7 @@
                       <w:sz w:val="20"/>
                       <w:szCs w:val="20"/>
                     </w:rPr>
-                    <w:t xml:space="preserve">2. Schreibe dazu die Zahl der Menschen: 150 000 · 500 000 · 20 000 000.</w:t>
+                    <w:t xml:space="preserve">2. Seine Macht komme vom Volk, sagte er (Gottesgnadentum).</w:t>
                   </w:r>
                 </w:p>
                 <w:p>
@@ -3648,7 +3648,21 @@
                       <w:sz w:val="20"/>
                       <w:szCs w:val="20"/>
                     </w:rPr>
-                    <w:t xml:space="preserve">3. Schreibe hinter die beiden Stände mit Vorrechten: „zahlt keine Steuern“.</w:t>
+                    <w:t xml:space="preserve">3. Zum Klerus gehörten etwa 20 Millionen Menschen, zum Adel etwa 500 000.</w:t>
+                  </w:r>
+                </w:p>
+                <w:p>
+                  <w:pPr>
+                    <w:spacing w:after="30" w:before="0"/>
+                  </w:pPr>
+                  <w:r>
+                    <w:rPr>
+                      <w:rFonts w:ascii="Cambria" w:cs="Cambria" w:eastAsia="Cambria" w:hAnsi="Cambria"/>
+                      <w:color w:val="000000"/>
+                      <w:sz w:val="20"/>
+                      <w:szCs w:val="20"/>
+                    </w:rPr>
+                    <w:t xml:space="preserve">4. Klerus und Adel zahlten die meisten Steuern.</w:t>
                   </w:r>
                 </w:p>
                 <w:p>
@@ -3662,7 +3676,21 @@
                       <w:sz w:val="20"/>
                       <w:szCs w:val="20"/>
                     </w:rPr>
-                    <w:t xml:space="preserve">4. Beende: „Die Steuern zahlt der …“</w:t>
+                    <w:t xml:space="preserve">5. Der Dritte Stand (Bauern und Bürger) hatte kaum Vorrechte.</w:t>
+                  </w:r>
+                </w:p>
+                <w:p>
+                  <w:pPr>
+                    <w:spacing w:after="40" w:before="0"/>
+                  </w:pPr>
+                  <w:r>
+                    <w:rPr>
+                      <w:rFonts w:ascii="Cambria" w:cs="Cambria" w:eastAsia="Cambria" w:hAnsi="Cambria"/>
+                      <w:color w:val="000000"/>
+                      <w:sz w:val="20"/>
+                      <w:szCs w:val="20"/>
+                    </w:rPr>
+                    <w:t xml:space="preserve">Aufgabe: Vier Sätze enthalten einen Fehler. Unterstreiche die Fehler und schreibe diese Sätze richtig ins Heft.</w:t>
                   </w:r>
                 </w:p>
                 <w:p>
@@ -3740,7 +3768,7 @@
                 <w:sz w:val="19"/>
                 <w:szCs w:val="19"/>
               </w:rPr>
-              <w:t xml:space="preserve">Klerus 150 000 · Adel 500 000 · Dritter Stand (Bauern und Bürger) 20 000 000. Klerus und Adel zahlen keine Steuern. Die Steuern zahlt der Dritte Stand (Bauern und Bürger).</w:t>
+              <w:t xml:space="preserve">Fehler in 1 (der König regiert allein, ohne die Stände), 2 (die Macht kommt von Gott), 3 (der Klerus hat etwa 150 000 Mitglieder), 4 (Klerus und Adel zahlen keine Steuern). Satz 5 ist richtig. Die Zahlen stammen aus dem Gruppenpuzzle (150 000 / 500 000 / 20 000 000).</w:t>
             </w:r>
           </w:p>
         </w:tc>
@@ -6836,7 +6864,7 @@
                 <w:sz w:val="20"/>
                 <w:szCs w:val="20"/>
               </w:rPr>
-              <w:t xml:space="preserve">Drei Stände mit Zahlen, Vorrechte, „Die Steuern zahlt der …“ (Verbesserungen grün)</w:t>
+              <w:t xml:space="preserve">Fehlertext: vier verbesserte Sätze (Verbesserungen grün)</w:t>
             </w:r>
           </w:p>
         </w:tc>

</xml_diff>